<commit_message>
fix docx source files: correct all wrong answers (20 fixes)
</commit_message>
<xml_diff>
--- a/questions/1-1_클라우드컴퓨팅_2부 (32문제).docx
+++ b/questions/1-1_클라우드컴퓨팅_2부 (32문제).docx
@@ -73,13 +73,11 @@
           <w:b/>
           <w:color w:val="0000FF"/>
         </w:rPr>
-        <w:t xml:space="preserve">A. </w:t>
-      </w:r>
-      <w:r>
-        <w:t>예0-아니오-예</w:t>
+        <w:t>A. 예-예-아니오</w:t>
         <w:br/>
         <w:t>105</w:t>
       </w:r>
+      <w:r/>
     </w:p>
     <w:p/>
     <w:p>
@@ -238,13 +236,11 @@
           <w:b/>
           <w:color w:val="0000FF"/>
         </w:rPr>
-        <w:t xml:space="preserve">A. </w:t>
-      </w:r>
-      <w:r>
-        <w:t>아니오-아니오-예</w:t>
+        <w:t>A. 아니오-예-예</w:t>
         <w:br/>
         <w:t>136</w:t>
       </w:r>
+      <w:r/>
     </w:p>
     <w:p/>
     <w:p>
@@ -308,13 +304,11 @@
           <w:b/>
           <w:color w:val="0000FF"/>
         </w:rPr>
-        <w:t xml:space="preserve">A. </w:t>
-      </w:r>
-      <w:r>
-        <w:t>1</w:t>
+        <w:t>A. 4</w:t>
         <w:br/>
         <w:t>140</w:t>
       </w:r>
+      <w:r/>
     </w:p>
     <w:p/>
     <w:p>
@@ -409,13 +403,11 @@
           <w:b/>
           <w:color w:val="0000FF"/>
         </w:rPr>
-        <w:t xml:space="preserve">A. </w:t>
-      </w:r>
-      <w:r>
-        <w:t>예-예-아니오</w:t>
+        <w:t>A. 예-아니오-예</w:t>
         <w:br/>
         <w:t>187</w:t>
       </w:r>
+      <w:r/>
     </w:p>
     <w:p/>
     <w:sectPr>

</xml_diff>